<commit_message>
template word + price submitte
</commit_message>
<xml_diff>
--- a/Invoice(Fatura)_Teiker.docx
+++ b/Invoice(Fatura)_Teiker.docx
@@ -61,7 +61,7 @@
                           </pic:cNvPicPr>
                         </pic:nvPicPr>
                         <pic:blipFill rotWithShape="1">
-                          <a:blip r:embed="rId11" cstate="print">
+                          <a:blip r:embed="rId10" cstate="print">
                             <a:extLst>
                               <a:ext uri="{28A0092B-C50C-407E-A947-70E740481C1C}">
                                 <a14:useLocalDpi xmlns:a14="http://schemas.microsoft.com/office/drawing/2010/main" val="0"/>
@@ -244,6 +244,7 @@
                   <w:docPart w:val="69346F0E2F04434496D0050473145154"/>
                 </w:placeholder>
               </w:sdtPr>
+              <w:sdtEndPr/>
               <w:sdtContent>
                 <w:r>
                   <w:rPr>
@@ -257,7 +258,9 @@
                       <w:name w:val="invoice_date"/>
                       <w:enabled/>
                       <w:calcOnExit w:val="0"/>
-                      <w:textInput/>
+                      <w:textInput>
+                        <w:default w:val="invoice_date"/>
+                      </w:textInput>
                     </w:ffData>
                   </w:fldChar>
                 </w:r>
@@ -296,47 +299,7 @@
                     <w:szCs w:val="24"/>
                     <w:lang w:val="pt-PT"/>
                   </w:rPr>
-                  <w:t> </w:t>
-                </w:r>
-                <w:r>
-                  <w:rPr>
-                    <w:noProof/>
-                    <w:color w:val="375439" w:themeColor="accent1" w:themeShade="80"/>
-                    <w:sz w:val="24"/>
-                    <w:szCs w:val="24"/>
-                    <w:lang w:val="pt-PT"/>
-                  </w:rPr>
-                  <w:t> </w:t>
-                </w:r>
-                <w:r>
-                  <w:rPr>
-                    <w:noProof/>
-                    <w:color w:val="375439" w:themeColor="accent1" w:themeShade="80"/>
-                    <w:sz w:val="24"/>
-                    <w:szCs w:val="24"/>
-                    <w:lang w:val="pt-PT"/>
-                  </w:rPr>
-                  <w:t> </w:t>
-                </w:r>
-                <w:r>
-                  <w:rPr>
-                    <w:noProof/>
-                    <w:color w:val="375439" w:themeColor="accent1" w:themeShade="80"/>
-                    <w:sz w:val="24"/>
-                    <w:szCs w:val="24"/>
-                    <w:lang w:val="pt-PT"/>
-                  </w:rPr>
-                  <w:t> </w:t>
-                </w:r>
-                <w:r>
-                  <w:rPr>
-                    <w:noProof/>
-                    <w:color w:val="375439" w:themeColor="accent1" w:themeShade="80"/>
-                    <w:sz w:val="24"/>
-                    <w:szCs w:val="24"/>
-                    <w:lang w:val="pt-PT"/>
-                  </w:rPr>
-                  <w:t> </w:t>
+                  <w:t>invoice_date</w:t>
                 </w:r>
                 <w:r>
                   <w:rPr>
@@ -413,7 +376,9 @@
                   <w:name w:val="invoice_number"/>
                   <w:enabled/>
                   <w:calcOnExit w:val="0"/>
-                  <w:textInput/>
+                  <w:textInput>
+                    <w:default w:val="invoice_number"/>
+                  </w:textInput>
                 </w:ffData>
               </w:fldChar>
             </w:r>
@@ -452,47 +417,7 @@
                 <w:szCs w:val="24"/>
                 <w:lang w:val="pt-PT"/>
               </w:rPr>
-              <w:t> </w:t>
-            </w:r>
-            <w:r>
-              <w:rPr>
-                <w:noProof/>
-                <w:color w:val="375439" w:themeColor="accent1" w:themeShade="80"/>
-                <w:sz w:val="24"/>
-                <w:szCs w:val="24"/>
-                <w:lang w:val="pt-PT"/>
-              </w:rPr>
-              <w:t> </w:t>
-            </w:r>
-            <w:r>
-              <w:rPr>
-                <w:noProof/>
-                <w:color w:val="375439" w:themeColor="accent1" w:themeShade="80"/>
-                <w:sz w:val="24"/>
-                <w:szCs w:val="24"/>
-                <w:lang w:val="pt-PT"/>
-              </w:rPr>
-              <w:t> </w:t>
-            </w:r>
-            <w:r>
-              <w:rPr>
-                <w:noProof/>
-                <w:color w:val="375439" w:themeColor="accent1" w:themeShade="80"/>
-                <w:sz w:val="24"/>
-                <w:szCs w:val="24"/>
-                <w:lang w:val="pt-PT"/>
-              </w:rPr>
-              <w:t> </w:t>
-            </w:r>
-            <w:r>
-              <w:rPr>
-                <w:noProof/>
-                <w:color w:val="375439" w:themeColor="accent1" w:themeShade="80"/>
-                <w:sz w:val="24"/>
-                <w:szCs w:val="24"/>
-                <w:lang w:val="pt-PT"/>
-              </w:rPr>
-              <w:t> </w:t>
+              <w:t>invoice_number</w:t>
             </w:r>
             <w:r>
               <w:rPr>
@@ -533,6 +458,7 @@
                 <w:docPart w:val="0AB559449F428347B6D28F8DEF044FA2"/>
               </w:placeholder>
             </w:sdtPr>
+            <w:sdtEndPr/>
             <w:sdtContent>
               <w:p>
                 <w:pPr>
@@ -581,6 +507,7 @@
                 <w:docPart w:val="14CB122C902B0546B41E9560F9223D60"/>
               </w:placeholder>
             </w:sdtPr>
+            <w:sdtEndPr/>
             <w:sdtContent>
               <w:p>
                 <w:pPr>
@@ -633,6 +560,7 @@
                 <w:docPart w:val="D14AA4190D95094BA0DAF14EBD6053F5"/>
               </w:placeholder>
             </w:sdtPr>
+            <w:sdtEndPr/>
             <w:sdtContent>
               <w:p>
                 <w:pPr>
@@ -695,6 +623,66 @@
                 <w:docPart w:val="A2BD95426524BC499068E639D1C17270"/>
               </w:placeholder>
             </w:sdtPr>
+            <w:sdtEndPr/>
+            <w:sdtContent>
+              <w:p>
+                <w:pPr>
+                  <w:pStyle w:val="textoalinhadodireita"/>
+                  <w:rPr>
+                    <w:color w:val="375439" w:themeColor="accent1" w:themeShade="80"/>
+                    <w:sz w:val="24"/>
+                    <w:szCs w:val="24"/>
+                    <w:lang w:val="pt-PT"/>
+                  </w:rPr>
+                </w:pPr>
+                <w:proofErr w:type="spellStart"/>
+                <w:r>
+                  <w:rPr>
+                    <w:color w:val="375439" w:themeColor="accent1" w:themeShade="80"/>
+                    <w:sz w:val="24"/>
+                    <w:szCs w:val="24"/>
+                    <w:lang w:val="pt-PT"/>
+                  </w:rPr>
+                  <w:t>Family</w:t>
+                </w:r>
+                <w:proofErr w:type="spellEnd"/>
+                <w:r>
+                  <w:rPr>
+                    <w:color w:val="375439" w:themeColor="accent1" w:themeShade="80"/>
+                    <w:sz w:val="24"/>
+                    <w:szCs w:val="24"/>
+                    <w:lang w:val="pt-PT"/>
+                  </w:rPr>
+                  <w:t xml:space="preserve"> </w:t>
+                </w:r>
+                <w:proofErr w:type="spellStart"/>
+                <w:r>
+                  <w:rPr>
+                    <w:color w:val="375439" w:themeColor="accent1" w:themeShade="80"/>
+                    <w:sz w:val="24"/>
+                    <w:szCs w:val="24"/>
+                    <w:lang w:val="pt-PT"/>
+                  </w:rPr>
+                  <w:t>Lokhorst</w:t>
+                </w:r>
+                <w:proofErr w:type="spellEnd"/>
+              </w:p>
+            </w:sdtContent>
+          </w:sdt>
+          <w:sdt>
+            <w:sdtPr>
+              <w:rPr>
+                <w:color w:val="375439" w:themeColor="accent1" w:themeShade="80"/>
+                <w:sz w:val="24"/>
+                <w:szCs w:val="24"/>
+                <w:lang w:val="pt-PT"/>
+              </w:rPr>
+              <w:id w:val="716560484"/>
+              <w:placeholder>
+                <w:docPart w:val="3A39D44DBAE153429B3976283BD05512"/>
+              </w:placeholder>
+            </w:sdtPr>
+            <w:sdtEndPr/>
             <w:sdtContent>
               <w:p>
                 <w:pPr>
@@ -713,16 +701,9 @@
                     <w:szCs w:val="24"/>
                     <w:lang w:val="pt-PT"/>
                   </w:rPr>
-                  <w:fldChar w:fldCharType="begin">
-                    <w:ffData>
-                      <w:name w:val="client_name"/>
-                      <w:enabled/>
-                      <w:calcOnExit w:val="0"/>
-                      <w:textInput/>
-                    </w:ffData>
-                  </w:fldChar>
+                  <w:t xml:space="preserve">Obere </w:t>
                 </w:r>
-                <w:bookmarkStart w:id="2" w:name="client_name"/>
+                <w:proofErr w:type="spellStart"/>
                 <w:r>
                   <w:rPr>
                     <w:color w:val="375439" w:themeColor="accent1" w:themeShade="80"/>
@@ -730,8 +711,9 @@
                     <w:szCs w:val="24"/>
                     <w:lang w:val="pt-PT"/>
                   </w:rPr>
-                  <w:instrText xml:space="preserve"> FORMTEXT </w:instrText>
+                  <w:t>Fangstrasse</w:t>
                 </w:r>
+                <w:proofErr w:type="spellEnd"/>
                 <w:r>
                   <w:rPr>
                     <w:color w:val="375439" w:themeColor="accent1" w:themeShade="80"/>
@@ -739,193 +721,11 @@
                     <w:szCs w:val="24"/>
                     <w:lang w:val="pt-PT"/>
                   </w:rPr>
-                </w:r>
-                <w:r>
-                  <w:rPr>
-                    <w:color w:val="375439" w:themeColor="accent1" w:themeShade="80"/>
-                    <w:sz w:val="24"/>
-                    <w:szCs w:val="24"/>
-                    <w:lang w:val="pt-PT"/>
-                  </w:rPr>
-                  <w:fldChar w:fldCharType="separate"/>
-                </w:r>
-                <w:r>
-                  <w:rPr>
-                    <w:noProof/>
-                    <w:color w:val="375439" w:themeColor="accent1" w:themeShade="80"/>
-                    <w:sz w:val="24"/>
-                    <w:szCs w:val="24"/>
-                    <w:lang w:val="pt-PT"/>
-                  </w:rPr>
-                  <w:t> </w:t>
-                </w:r>
-                <w:r>
-                  <w:rPr>
-                    <w:noProof/>
-                    <w:color w:val="375439" w:themeColor="accent1" w:themeShade="80"/>
-                    <w:sz w:val="24"/>
-                    <w:szCs w:val="24"/>
-                    <w:lang w:val="pt-PT"/>
-                  </w:rPr>
-                  <w:t> </w:t>
-                </w:r>
-                <w:r>
-                  <w:rPr>
-                    <w:noProof/>
-                    <w:color w:val="375439" w:themeColor="accent1" w:themeShade="80"/>
-                    <w:sz w:val="24"/>
-                    <w:szCs w:val="24"/>
-                    <w:lang w:val="pt-PT"/>
-                  </w:rPr>
-                  <w:t> </w:t>
-                </w:r>
-                <w:r>
-                  <w:rPr>
-                    <w:noProof/>
-                    <w:color w:val="375439" w:themeColor="accent1" w:themeShade="80"/>
-                    <w:sz w:val="24"/>
-                    <w:szCs w:val="24"/>
-                    <w:lang w:val="pt-PT"/>
-                  </w:rPr>
-                  <w:t> </w:t>
-                </w:r>
-                <w:r>
-                  <w:rPr>
-                    <w:noProof/>
-                    <w:color w:val="375439" w:themeColor="accent1" w:themeShade="80"/>
-                    <w:sz w:val="24"/>
-                    <w:szCs w:val="24"/>
-                    <w:lang w:val="pt-PT"/>
-                  </w:rPr>
-                  <w:t> </w:t>
-                </w:r>
-                <w:r>
-                  <w:rPr>
-                    <w:color w:val="375439" w:themeColor="accent1" w:themeShade="80"/>
-                    <w:sz w:val="24"/>
-                    <w:szCs w:val="24"/>
-                    <w:lang w:val="pt-PT"/>
-                  </w:rPr>
-                  <w:fldChar w:fldCharType="end"/>
+                  <w:t xml:space="preserve"> 26</w:t>
                 </w:r>
               </w:p>
-              <w:bookmarkEnd w:id="2" w:displacedByCustomXml="next"/>
             </w:sdtContent>
           </w:sdt>
-          <w:p>
-            <w:pPr>
-              <w:pStyle w:val="textoalinhadodireita"/>
-              <w:rPr>
-                <w:color w:val="375439" w:themeColor="accent1" w:themeShade="80"/>
-                <w:sz w:val="24"/>
-                <w:szCs w:val="24"/>
-                <w:lang w:val="pt-PT"/>
-              </w:rPr>
-            </w:pPr>
-            <w:r>
-              <w:rPr>
-                <w:color w:val="375439" w:themeColor="accent1" w:themeShade="80"/>
-                <w:sz w:val="24"/>
-                <w:szCs w:val="24"/>
-                <w:lang w:val="pt-PT"/>
-              </w:rPr>
-              <w:fldChar w:fldCharType="begin">
-                <w:ffData>
-                  <w:name w:val="client_address"/>
-                  <w:enabled/>
-                  <w:calcOnExit w:val="0"/>
-                  <w:textInput/>
-                </w:ffData>
-              </w:fldChar>
-            </w:r>
-            <w:bookmarkStart w:id="3" w:name="client_address"/>
-            <w:r>
-              <w:rPr>
-                <w:color w:val="375439" w:themeColor="accent1" w:themeShade="80"/>
-                <w:sz w:val="24"/>
-                <w:szCs w:val="24"/>
-                <w:lang w:val="pt-PT"/>
-              </w:rPr>
-              <w:instrText xml:space="preserve"> FORMTEXT </w:instrText>
-            </w:r>
-            <w:r>
-              <w:rPr>
-                <w:color w:val="375439" w:themeColor="accent1" w:themeShade="80"/>
-                <w:sz w:val="24"/>
-                <w:szCs w:val="24"/>
-                <w:lang w:val="pt-PT"/>
-              </w:rPr>
-            </w:r>
-            <w:r>
-              <w:rPr>
-                <w:color w:val="375439" w:themeColor="accent1" w:themeShade="80"/>
-                <w:sz w:val="24"/>
-                <w:szCs w:val="24"/>
-                <w:lang w:val="pt-PT"/>
-              </w:rPr>
-              <w:fldChar w:fldCharType="separate"/>
-            </w:r>
-            <w:r>
-              <w:rPr>
-                <w:noProof/>
-                <w:color w:val="375439" w:themeColor="accent1" w:themeShade="80"/>
-                <w:sz w:val="24"/>
-                <w:szCs w:val="24"/>
-                <w:lang w:val="pt-PT"/>
-              </w:rPr>
-              <w:t> </w:t>
-            </w:r>
-            <w:r>
-              <w:rPr>
-                <w:noProof/>
-                <w:color w:val="375439" w:themeColor="accent1" w:themeShade="80"/>
-                <w:sz w:val="24"/>
-                <w:szCs w:val="24"/>
-                <w:lang w:val="pt-PT"/>
-              </w:rPr>
-              <w:t> </w:t>
-            </w:r>
-            <w:r>
-              <w:rPr>
-                <w:noProof/>
-                <w:color w:val="375439" w:themeColor="accent1" w:themeShade="80"/>
-                <w:sz w:val="24"/>
-                <w:szCs w:val="24"/>
-                <w:lang w:val="pt-PT"/>
-              </w:rPr>
-              <w:t> </w:t>
-            </w:r>
-            <w:r>
-              <w:rPr>
-                <w:noProof/>
-                <w:color w:val="375439" w:themeColor="accent1" w:themeShade="80"/>
-                <w:sz w:val="24"/>
-                <w:szCs w:val="24"/>
-                <w:lang w:val="pt-PT"/>
-              </w:rPr>
-              <w:t> </w:t>
-            </w:r>
-            <w:r>
-              <w:rPr>
-                <w:noProof/>
-                <w:color w:val="375439" w:themeColor="accent1" w:themeShade="80"/>
-                <w:sz w:val="24"/>
-                <w:szCs w:val="24"/>
-                <w:lang w:val="pt-PT"/>
-              </w:rPr>
-              <w:t> </w:t>
-            </w:r>
-            <w:r>
-              <w:rPr>
-                <w:color w:val="375439" w:themeColor="accent1" w:themeShade="80"/>
-                <w:sz w:val="24"/>
-                <w:szCs w:val="24"/>
-                <w:lang w:val="pt-PT"/>
-              </w:rPr>
-              <w:fldChar w:fldCharType="end"/>
-            </w:r>
-            <w:bookmarkEnd w:id="3"/>
-          </w:p>
           <w:sdt>
             <w:sdtPr>
               <w:rPr>
@@ -939,6 +739,7 @@
                 <w:docPart w:val="05EC02B115654142A3572209B071F202"/>
               </w:placeholder>
             </w:sdtPr>
+            <w:sdtEndPr/>
             <w:sdtContent>
               <w:p>
                 <w:pPr>
@@ -957,102 +758,8 @@
                     <w:szCs w:val="24"/>
                     <w:lang w:val="pt-PT"/>
                   </w:rPr>
-                  <w:fldChar w:fldCharType="begin">
-                    <w:ffData>
-                      <w:name w:val="client_postal_code"/>
-                      <w:enabled/>
-                      <w:calcOnExit w:val="0"/>
-                      <w:textInput/>
-                    </w:ffData>
-                  </w:fldChar>
+                  <w:t>3782</w:t>
                 </w:r>
-                <w:bookmarkStart w:id="4" w:name="client_postal_code"/>
-                <w:r>
-                  <w:rPr>
-                    <w:color w:val="375439" w:themeColor="accent1" w:themeShade="80"/>
-                    <w:sz w:val="24"/>
-                    <w:szCs w:val="24"/>
-                    <w:lang w:val="pt-PT"/>
-                  </w:rPr>
-                  <w:instrText xml:space="preserve"> FORMTEXT </w:instrText>
-                </w:r>
-                <w:r>
-                  <w:rPr>
-                    <w:color w:val="375439" w:themeColor="accent1" w:themeShade="80"/>
-                    <w:sz w:val="24"/>
-                    <w:szCs w:val="24"/>
-                    <w:lang w:val="pt-PT"/>
-                  </w:rPr>
-                </w:r>
-                <w:r>
-                  <w:rPr>
-                    <w:color w:val="375439" w:themeColor="accent1" w:themeShade="80"/>
-                    <w:sz w:val="24"/>
-                    <w:szCs w:val="24"/>
-                    <w:lang w:val="pt-PT"/>
-                  </w:rPr>
-                  <w:fldChar w:fldCharType="separate"/>
-                </w:r>
-                <w:r>
-                  <w:rPr>
-                    <w:noProof/>
-                    <w:color w:val="375439" w:themeColor="accent1" w:themeShade="80"/>
-                    <w:sz w:val="24"/>
-                    <w:szCs w:val="24"/>
-                    <w:lang w:val="pt-PT"/>
-                  </w:rPr>
-                  <w:t> </w:t>
-                </w:r>
-                <w:r>
-                  <w:rPr>
-                    <w:noProof/>
-                    <w:color w:val="375439" w:themeColor="accent1" w:themeShade="80"/>
-                    <w:sz w:val="24"/>
-                    <w:szCs w:val="24"/>
-                    <w:lang w:val="pt-PT"/>
-                  </w:rPr>
-                  <w:t> </w:t>
-                </w:r>
-                <w:r>
-                  <w:rPr>
-                    <w:noProof/>
-                    <w:color w:val="375439" w:themeColor="accent1" w:themeShade="80"/>
-                    <w:sz w:val="24"/>
-                    <w:szCs w:val="24"/>
-                    <w:lang w:val="pt-PT"/>
-                  </w:rPr>
-                  <w:t> </w:t>
-                </w:r>
-                <w:r>
-                  <w:rPr>
-                    <w:noProof/>
-                    <w:color w:val="375439" w:themeColor="accent1" w:themeShade="80"/>
-                    <w:sz w:val="24"/>
-                    <w:szCs w:val="24"/>
-                    <w:lang w:val="pt-PT"/>
-                  </w:rPr>
-                  <w:t> </w:t>
-                </w:r>
-                <w:r>
-                  <w:rPr>
-                    <w:noProof/>
-                    <w:color w:val="375439" w:themeColor="accent1" w:themeShade="80"/>
-                    <w:sz w:val="24"/>
-                    <w:szCs w:val="24"/>
-                    <w:lang w:val="pt-PT"/>
-                  </w:rPr>
-                  <w:t> </w:t>
-                </w:r>
-                <w:r>
-                  <w:rPr>
-                    <w:color w:val="375439" w:themeColor="accent1" w:themeShade="80"/>
-                    <w:sz w:val="24"/>
-                    <w:szCs w:val="24"/>
-                    <w:lang w:val="pt-PT"/>
-                  </w:rPr>
-                  <w:fldChar w:fldCharType="end"/>
-                </w:r>
-                <w:bookmarkEnd w:id="4"/>
               </w:p>
               <w:p>
                 <w:pPr>
@@ -1071,24 +778,7 @@
                     <w:szCs w:val="24"/>
                     <w:lang w:val="pt-PT"/>
                   </w:rPr>
-                  <w:fldChar w:fldCharType="begin">
-                    <w:ffData>
-                      <w:name w:val="client_city"/>
-                      <w:enabled/>
-                      <w:calcOnExit w:val="0"/>
-                      <w:textInput/>
-                    </w:ffData>
-                  </w:fldChar>
-                </w:r>
-                <w:bookmarkStart w:id="5" w:name="client_city"/>
-                <w:r>
-                  <w:rPr>
-                    <w:color w:val="375439" w:themeColor="accent1" w:themeShade="80"/>
-                    <w:sz w:val="24"/>
-                    <w:szCs w:val="24"/>
-                    <w:lang w:val="pt-PT"/>
-                  </w:rPr>
-                  <w:instrText xml:space="preserve"> FORMTEXT </w:instrText>
+                  <w:t>L</w:t>
                 </w:r>
                 <w:r>
                   <w:rPr>
@@ -1097,77 +787,9 @@
                     <w:szCs w:val="24"/>
                     <w:lang w:val="pt-PT"/>
                   </w:rPr>
-                </w:r>
-                <w:r>
-                  <w:rPr>
-                    <w:color w:val="375439" w:themeColor="accent1" w:themeShade="80"/>
-                    <w:sz w:val="24"/>
-                    <w:szCs w:val="24"/>
-                    <w:lang w:val="pt-PT"/>
-                  </w:rPr>
-                  <w:fldChar w:fldCharType="separate"/>
-                </w:r>
-                <w:r>
-                  <w:rPr>
-                    <w:noProof/>
-                    <w:color w:val="375439" w:themeColor="accent1" w:themeShade="80"/>
-                    <w:sz w:val="24"/>
-                    <w:szCs w:val="24"/>
-                    <w:lang w:val="pt-PT"/>
-                  </w:rPr>
-                  <w:t> </w:t>
-                </w:r>
-                <w:r>
-                  <w:rPr>
-                    <w:noProof/>
-                    <w:color w:val="375439" w:themeColor="accent1" w:themeShade="80"/>
-                    <w:sz w:val="24"/>
-                    <w:szCs w:val="24"/>
-                    <w:lang w:val="pt-PT"/>
-                  </w:rPr>
-                  <w:t> </w:t>
-                </w:r>
-                <w:r>
-                  <w:rPr>
-                    <w:noProof/>
-                    <w:color w:val="375439" w:themeColor="accent1" w:themeShade="80"/>
-                    <w:sz w:val="24"/>
-                    <w:szCs w:val="24"/>
-                    <w:lang w:val="pt-PT"/>
-                  </w:rPr>
-                  <w:t> </w:t>
-                </w:r>
-                <w:r>
-                  <w:rPr>
-                    <w:noProof/>
-                    <w:color w:val="375439" w:themeColor="accent1" w:themeShade="80"/>
-                    <w:sz w:val="24"/>
-                    <w:szCs w:val="24"/>
-                    <w:lang w:val="pt-PT"/>
-                  </w:rPr>
-                  <w:t> </w:t>
-                </w:r>
-                <w:r>
-                  <w:rPr>
-                    <w:noProof/>
-                    <w:color w:val="375439" w:themeColor="accent1" w:themeShade="80"/>
-                    <w:sz w:val="24"/>
-                    <w:szCs w:val="24"/>
-                    <w:lang w:val="pt-PT"/>
-                  </w:rPr>
-                  <w:t> </w:t>
-                </w:r>
-                <w:r>
-                  <w:rPr>
-                    <w:color w:val="375439" w:themeColor="accent1" w:themeShade="80"/>
-                    <w:sz w:val="24"/>
-                    <w:szCs w:val="24"/>
-                    <w:lang w:val="pt-PT"/>
-                  </w:rPr>
-                  <w:fldChar w:fldCharType="end"/>
+                  <w:t>AUENEN</w:t>
                 </w:r>
               </w:p>
-              <w:bookmarkEnd w:id="5" w:displacedByCustomXml="next"/>
             </w:sdtContent>
           </w:sdt>
         </w:tc>
@@ -1916,6 +1538,55 @@
                 <w:lang w:val="pt-PT"/>
               </w:rPr>
             </w:pPr>
+            <w:r>
+              <w:rPr>
+                <w:color w:val="375439" w:themeColor="accent1" w:themeShade="80"/>
+                <w:sz w:val="24"/>
+                <w:szCs w:val="24"/>
+                <w:lang w:val="pt-PT"/>
+              </w:rPr>
+              <w:t xml:space="preserve">#Payment </w:t>
+            </w:r>
+            <w:proofErr w:type="spellStart"/>
+            <w:r>
+              <w:rPr>
+                <w:color w:val="375439" w:themeColor="accent1" w:themeShade="80"/>
+                <w:sz w:val="24"/>
+                <w:szCs w:val="24"/>
+                <w:lang w:val="pt-PT"/>
+              </w:rPr>
+              <w:t>within</w:t>
+            </w:r>
+            <w:proofErr w:type="spellEnd"/>
+            <w:r>
+              <w:rPr>
+                <w:color w:val="375439" w:themeColor="accent1" w:themeShade="80"/>
+                <w:sz w:val="24"/>
+                <w:szCs w:val="24"/>
+                <w:lang w:val="pt-PT"/>
+              </w:rPr>
+              <w:t xml:space="preserve"> 10 </w:t>
+            </w:r>
+            <w:proofErr w:type="spellStart"/>
+            <w:r>
+              <w:rPr>
+                <w:color w:val="375439" w:themeColor="accent1" w:themeShade="80"/>
+                <w:sz w:val="24"/>
+                <w:szCs w:val="24"/>
+                <w:lang w:val="pt-PT"/>
+              </w:rPr>
+              <w:t>days</w:t>
+            </w:r>
+            <w:proofErr w:type="spellEnd"/>
+            <w:r>
+              <w:rPr>
+                <w:color w:val="375439" w:themeColor="accent1" w:themeShade="80"/>
+                <w:sz w:val="24"/>
+                <w:szCs w:val="24"/>
+                <w:lang w:val="pt-PT"/>
+              </w:rPr>
+              <w:t xml:space="preserve"> net</w:t>
+            </w:r>
           </w:p>
         </w:tc>
       </w:tr>
@@ -1978,6 +1649,7 @@
             <w:docPart w:val="27BD909F2A6B75458648C150E1BFC6D9"/>
           </w:placeholder>
         </w:sdtPr>
+        <w:sdtEndPr/>
         <w:sdtContent>
           <w:proofErr w:type="spellStart"/>
           <w:r>
@@ -2013,6 +1685,7 @@
             <w:docPart w:val="79360773C6411E40A350D24DFC9866FC"/>
           </w:placeholder>
         </w:sdtPr>
+        <w:sdtEndPr/>
         <w:sdtContent>
           <w:proofErr w:type="spellStart"/>
           <w:r>
@@ -2057,6 +1730,7 @@
             <w:docPart w:val="E62327E3A5DAD248B04B1D2A0F6BBA5E"/>
           </w:placeholder>
         </w:sdtPr>
+        <w:sdtEndPr/>
         <w:sdtContent>
           <w:r>
             <w:rPr>
@@ -2118,6 +1792,7 @@
             <w:docPart w:val="03458B7B848F394DACE7E8CB6FDD7E1B"/>
           </w:placeholder>
         </w:sdtPr>
+        <w:sdtEndPr/>
         <w:sdtContent>
           <w:r>
             <w:rPr>
@@ -2126,7 +1801,16 @@
               <w:szCs w:val="24"/>
               <w:lang w:val="pt-PT"/>
             </w:rPr>
-            <w:t>CHE- 132.923.990</w:t>
+            <w:t xml:space="preserve">CHE- </w:t>
+          </w:r>
+          <w:r>
+            <w:rPr>
+              <w:color w:val="375439" w:themeColor="accent1" w:themeShade="80"/>
+              <w:sz w:val="24"/>
+              <w:szCs w:val="24"/>
+              <w:lang w:val="pt-PT"/>
+            </w:rPr>
+            <w:t>274.296.679</w:t>
           </w:r>
         </w:sdtContent>
       </w:sdt>
@@ -2188,19 +1872,16 @@
             <w:docPart w:val="B1C605FF812E0C4EA8A7E2B87E8CBB24"/>
           </w:placeholder>
         </w:sdtPr>
+        <w:sdtEndPr/>
         <w:sdtContent>
-          <w:hyperlink r:id="rId12" w:history="1">
-            <w:r>
-              <w:rPr>
-                <w:rStyle w:val="Hiperligao"/>
-                <w:color w:val="375439" w:themeColor="accent1" w:themeShade="80"/>
-                <w:sz w:val="24"/>
-                <w:szCs w:val="24"/>
-                <w:lang w:val="pt-PT"/>
-              </w:rPr>
-              <w:t>soniapereiracaretaker@gmail.com</w:t>
-            </w:r>
-          </w:hyperlink>
+          <w:r>
+            <w:rPr>
+              <w:color w:val="365438"/>
+              <w:sz w:val="24"/>
+              <w:szCs w:val="24"/>
+            </w:rPr>
+            <w:t>info@teiker.ch</w:t>
+          </w:r>
         </w:sdtContent>
       </w:sdt>
       <w:r>
@@ -2258,6 +1939,7 @@
             <w:docPart w:val="E6B74F44A921604E974D558CB8FE69E4"/>
           </w:placeholder>
         </w:sdtPr>
+        <w:sdtEndPr/>
         <w:sdtContent>
           <w:r>
             <w:rPr>
@@ -2357,6 +2039,7 @@
             <w:docPart w:val="691F379E0C36754A8EFD6AAB3F77B1E8"/>
           </w:placeholder>
         </w:sdtPr>
+        <w:sdtEndPr/>
         <w:sdtContent>
           <w:r>
             <w:rPr>
@@ -2436,7 +2119,7 @@
               <w:sz w:val="24"/>
               <w:szCs w:val="24"/>
             </w:rPr>
-            <w:t>CH72 0079 0042 6034 01535</w:t>
+            <w:t>CH64 0079 0016 6284 5582 0</w:t>
           </w:r>
         </w:sdtContent>
       </w:sdt>
@@ -2545,7 +2228,7 @@
               <w:sz w:val="24"/>
               <w:szCs w:val="24"/>
             </w:rPr>
-            <w:t>0766273768</w:t>
+            <w:t>+41 766 273 768</w:t>
           </w:r>
         </w:sdtContent>
       </w:sdt>
@@ -2621,7 +2304,7 @@
         <v:path o:extrusionok="f" gradientshapeok="t" o:connecttype="rect"/>
         <o:lock v:ext="edit" aspectratio="t"/>
       </v:shapetype>
-      <v:shape id="_x0000_i1025" type="#_x0000_t75" alt="Logo placeholder" style="width:45pt;height:22.5pt" o:bullet="t">
+      <v:shape id="_x0000_i1025" type="#_x0000_t75" alt="Logo placeholder" style="width:3in;height:3in" o:bullet="t">
         <v:imagedata r:id="rId1" o:title="template_logo"/>
       </v:shape>
     </w:pict>
@@ -4065,6 +3748,32 @@
     </w:docPart>
     <w:docPart>
       <w:docPartPr>
+        <w:name w:val="3A39D44DBAE153429B3976283BD05512"/>
+        <w:category>
+          <w:name w:val="Geral"/>
+          <w:gallery w:val="placeholder"/>
+        </w:category>
+        <w:types>
+          <w:type w:val="bbPlcHdr"/>
+        </w:types>
+        <w:behaviors>
+          <w:behavior w:val="content"/>
+        </w:behaviors>
+        <w:guid w:val="{E3C96756-FFB5-D440-A7D7-C2C42F66C69A}"/>
+      </w:docPartPr>
+      <w:docPartBody>
+        <w:p>
+          <w:pPr>
+            <w:pStyle w:val="3A39D44DBAE153429B3976283BD05512"/>
+          </w:pPr>
+          <w:r>
+            <w:t>[Morada]</w:t>
+          </w:r>
+        </w:p>
+      </w:docPartBody>
+    </w:docPart>
+    <w:docPart>
+      <w:docPartPr>
         <w:name w:val="05EC02B115654142A3572209B071F202"/>
         <w:category>
           <w:name w:val="Geral"/>
@@ -4236,21 +3945,19 @@
   </w:compat>
   <w:rsids>
     <w:rsidRoot w:val="008825D6"/>
-    <w:rsid w:val="0006452B"/>
-    <w:rsid w:val="00290C9B"/>
     <w:rsid w:val="003853CA"/>
+    <w:rsid w:val="00430129"/>
     <w:rsid w:val="00481115"/>
     <w:rsid w:val="00567F17"/>
-    <w:rsid w:val="00592AC8"/>
     <w:rsid w:val="00767682"/>
+    <w:rsid w:val="007A1EC5"/>
     <w:rsid w:val="008825D6"/>
+    <w:rsid w:val="008A39E1"/>
+    <w:rsid w:val="0092455F"/>
     <w:rsid w:val="00A4350B"/>
-    <w:rsid w:val="00AA103C"/>
-    <w:rsid w:val="00C14597"/>
+    <w:rsid w:val="00BC1AA5"/>
     <w:rsid w:val="00C74A6C"/>
     <w:rsid w:val="00D12AB3"/>
-    <w:rsid w:val="00E4020A"/>
-    <w:rsid w:val="00E91497"/>
   </w:rsids>
   <m:mathPr>
     <m:mathFont m:val="Cambria Math"/>
@@ -5142,6 +4849,15 @@
 </file>
 
 <file path=customXml/item2.xml><?xml version="1.0" encoding="utf-8"?>
+<?mso-contentType ?>
+<FormTemplates xmlns="http://schemas.microsoft.com/sharepoint/v3/contenttype/forms">
+  <Display>DocumentLibraryForm</Display>
+  <Edit>AssetEditForm</Edit>
+  <New>DocumentLibraryForm</New>
+</FormTemplates>
+</file>
+
+<file path=customXml/item3.xml><?xml version="1.0" encoding="utf-8"?>
 <ct:contentTypeSchema xmlns:ct="http://schemas.microsoft.com/office/2006/metadata/contentType" xmlns:ma="http://schemas.microsoft.com/office/2006/metadata/properties/metaAttributes" ct:_="" ma:_="" ma:contentTypeName="TemplateFile" ma:contentTypeID="0x0101005EB5FCBB1E5ECD4D83FA6E62BA4F98FF04003B76559807ED7042AFCC9CD6E0E16B7A" ma:contentTypeVersion="56" ma:contentTypeDescription="Create a new document." ma:contentTypeScope="" ma:versionID="1bb8166288bc6583df760821a8465e9a">
   <xsd:schema xmlns:xsd="http://www.w3.org/2001/XMLSchema" xmlns:xs="http://www.w3.org/2001/XMLSchema" xmlns:p="http://schemas.microsoft.com/office/2006/metadata/properties" xmlns:ns2="8289c1ac-6532-4c62-99f0-6d047703163c" targetNamespace="http://schemas.microsoft.com/office/2006/metadata/properties" ma:root="true" ma:fieldsID="72dad6d391a7c203314e0cd163637bed" ns2:_="">
     <xsd:import namespace="8289c1ac-6532-4c62-99f0-6d047703163c"/>
@@ -6175,19 +5891,6 @@
 </ct:contentTypeSchema>
 </file>
 
-<file path=customXml/item3.xml><?xml version="1.0" encoding="utf-8"?>
-<?mso-contentType ?>
-<FormTemplates xmlns="http://schemas.microsoft.com/sharepoint/v3/contenttype/forms">
-  <Display>DocumentLibraryForm</Display>
-  <Edit>AssetEditForm</Edit>
-  <New>DocumentLibraryForm</New>
-</FormTemplates>
-</file>
-
-<file path=customXml/item4.xml><?xml version="1.0" encoding="utf-8"?>
-<b:Sources xmlns:b="http://schemas.openxmlformats.org/officeDocument/2006/bibliography" xmlns="http://schemas.openxmlformats.org/officeDocument/2006/bibliography" SelectedStyle="/APASixthEditionOfficeOnline.xsl" StyleName="APA" Version="6"/>
-</file>
-
 <file path=customXml/itemProps1.xml><?xml version="1.0" encoding="utf-8"?>
 <ds:datastoreItem xmlns:ds="http://schemas.openxmlformats.org/officeDocument/2006/customXml" ds:itemID="{8629318E-FB3C-4B31-A572-7E8640CD1647}">
   <ds:schemaRefs>
@@ -6199,6 +5902,14 @@
 </file>
 
 <file path=customXml/itemProps2.xml><?xml version="1.0" encoding="utf-8"?>
+<ds:datastoreItem xmlns:ds="http://schemas.openxmlformats.org/officeDocument/2006/customXml" ds:itemID="{FC836CF2-0FCF-4A80-9A4C-B5C0CC63139B}">
+  <ds:schemaRefs>
+    <ds:schemaRef ds:uri="http://schemas.microsoft.com/sharepoint/v3/contenttype/forms"/>
+  </ds:schemaRefs>
+</ds:datastoreItem>
+</file>
+
+<file path=customXml/itemProps3.xml><?xml version="1.0" encoding="utf-8"?>
 <ds:datastoreItem xmlns:ds="http://schemas.openxmlformats.org/officeDocument/2006/customXml" ds:itemID="{7ED942B4-9D86-4535-907A-8D9FA7D4C764}">
   <ds:schemaRefs>
     <ds:schemaRef ds:uri="http://schemas.microsoft.com/office/2006/metadata/contentType"/>
@@ -6214,20 +5925,4 @@
     <ds:schemaRef ds:uri="http://schemas.microsoft.com/internal/obd"/>
   </ds:schemaRefs>
 </ds:datastoreItem>
-</file>
-
-<file path=customXml/itemProps3.xml><?xml version="1.0" encoding="utf-8"?>
-<ds:datastoreItem xmlns:ds="http://schemas.openxmlformats.org/officeDocument/2006/customXml" ds:itemID="{FC836CF2-0FCF-4A80-9A4C-B5C0CC63139B}">
-  <ds:schemaRefs>
-    <ds:schemaRef ds:uri="http://schemas.microsoft.com/sharepoint/v3/contenttype/forms"/>
-  </ds:schemaRefs>
-</ds:datastoreItem>
-</file>
-
-<file path=customXml/itemProps4.xml><?xml version="1.0" encoding="utf-8"?>
-<ds:datastoreItem xmlns:ds="http://schemas.openxmlformats.org/officeDocument/2006/customXml" ds:itemID="{F579A6E9-6241-7441-A017-215707C8927A}">
-  <ds:schemaRefs>
-    <ds:schemaRef ds:uri="http://schemas.openxmlformats.org/officeDocument/2006/bibliography"/>
-  </ds:schemaRefs>
-</ds:datastoreItem>
 </file>
</xml_diff>

<commit_message>
Sistema Horas Extra Corrigido
</commit_message>
<xml_diff>
--- a/Invoice(Fatura)_Teiker.docx
+++ b/Invoice(Fatura)_Teiker.docx
@@ -112,6 +112,66 @@
                 <w:color w:val="284434"/>
               </w:rPr>
             </w:pPr>
+            <w:r>
+              <w:rPr>
+                <w:rFonts w:ascii="Microsoft Sans Serif" w:hAnsi="Microsoft Sans Serif" w:cs="Microsoft Sans Serif"/>
+                <w:color w:val="284434"/>
+              </w:rPr>
+              <w:t xml:space="preserve">                                            </w:t>
+            </w:r>
+            <w:r>
+              <w:rPr>
+                <w:rFonts w:ascii="Microsoft Sans Serif" w:hAnsi="Microsoft Sans Serif" w:cs="Microsoft Sans Serif"/>
+                <w:color w:val="284434"/>
+              </w:rPr>
+              <w:fldChar w:fldCharType="begin">
+                <w:ffData>
+                  <w:name w:val="qr_code"/>
+                  <w:enabled/>
+                  <w:calcOnExit w:val="0"/>
+                  <w:textInput>
+                    <w:default w:val="qr_code"/>
+                  </w:textInput>
+                </w:ffData>
+              </w:fldChar>
+            </w:r>
+            <w:bookmarkStart w:id="0" w:name="qr_code"/>
+            <w:r>
+              <w:rPr>
+                <w:rFonts w:ascii="Microsoft Sans Serif" w:hAnsi="Microsoft Sans Serif" w:cs="Microsoft Sans Serif"/>
+                <w:color w:val="284434"/>
+              </w:rPr>
+              <w:instrText xml:space="preserve"> FORMTEXT </w:instrText>
+            </w:r>
+            <w:r>
+              <w:rPr>
+                <w:rFonts w:ascii="Microsoft Sans Serif" w:hAnsi="Microsoft Sans Serif" w:cs="Microsoft Sans Serif"/>
+                <w:color w:val="284434"/>
+              </w:rPr>
+            </w:r>
+            <w:r>
+              <w:rPr>
+                <w:rFonts w:ascii="Microsoft Sans Serif" w:hAnsi="Microsoft Sans Serif" w:cs="Microsoft Sans Serif"/>
+                <w:color w:val="284434"/>
+              </w:rPr>
+              <w:fldChar w:fldCharType="separate"/>
+            </w:r>
+            <w:r>
+              <w:rPr>
+                <w:rFonts w:ascii="Microsoft Sans Serif" w:hAnsi="Microsoft Sans Serif" w:cs="Microsoft Sans Serif"/>
+                <w:noProof/>
+                <w:color w:val="284434"/>
+              </w:rPr>
+              <w:t>qr_code</w:t>
+            </w:r>
+            <w:r>
+              <w:rPr>
+                <w:rFonts w:ascii="Microsoft Sans Serif" w:hAnsi="Microsoft Sans Serif" w:cs="Microsoft Sans Serif"/>
+                <w:color w:val="284434"/>
+              </w:rPr>
+              <w:fldChar w:fldCharType="end"/>
+            </w:r>
+            <w:bookmarkEnd w:id="0"/>
           </w:p>
         </w:tc>
       </w:tr>
@@ -242,7 +302,7 @@
                 </w:placeholder>
               </w:sdtPr>
               <w:sdtContent>
-                <w:bookmarkStart w:id="0" w:name="invoice_date"/>
+                <w:bookmarkStart w:id="1" w:name="invoice_date"/>
                 <w:r>
                   <w:rPr>
                     <w:rFonts w:ascii="Microsoft Sans Serif" w:hAnsi="Microsoft Sans Serif" w:cs="Microsoft Sans Serif"/>
@@ -312,7 +372,7 @@
                   </w:rPr>
                   <w:fldChar w:fldCharType="end"/>
                 </w:r>
-                <w:bookmarkEnd w:id="0"/>
+                <w:bookmarkEnd w:id="1"/>
               </w:sdtContent>
             </w:sdt>
           </w:p>
@@ -390,7 +450,7 @@
                 </w:ffData>
               </w:fldChar>
             </w:r>
-            <w:bookmarkStart w:id="1" w:name="invoice_number"/>
+            <w:bookmarkStart w:id="2" w:name="invoice_number"/>
             <w:r>
               <w:rPr>
                 <w:rFonts w:ascii="Microsoft Sans Serif" w:hAnsi="Microsoft Sans Serif" w:cs="Microsoft Sans Serif"/>
@@ -441,7 +501,7 @@
               </w:rPr>
               <w:fldChar w:fldCharType="end"/>
             </w:r>
-            <w:bookmarkEnd w:id="1"/>
+            <w:bookmarkEnd w:id="2"/>
           </w:p>
         </w:tc>
       </w:tr>
@@ -680,7 +740,7 @@
                     </w:ffData>
                   </w:fldChar>
                 </w:r>
-                <w:bookmarkStart w:id="2" w:name="client_name"/>
+                <w:bookmarkStart w:id="3" w:name="client_name"/>
                 <w:r>
                   <w:rPr>
                     <w:rFonts w:ascii="Microsoft Sans Serif" w:hAnsi="Microsoft Sans Serif" w:cs="Microsoft Sans Serif"/>
@@ -732,7 +792,7 @@
                   <w:fldChar w:fldCharType="end"/>
                 </w:r>
               </w:p>
-              <w:bookmarkEnd w:id="2" w:displacedByCustomXml="next"/>
+              <w:bookmarkEnd w:id="3" w:displacedByCustomXml="next"/>
             </w:sdtContent>
           </w:sdt>
           <w:sdt>
@@ -780,7 +840,7 @@
                     </w:ffData>
                   </w:fldChar>
                 </w:r>
-                <w:bookmarkStart w:id="3" w:name="client_address"/>
+                <w:bookmarkStart w:id="4" w:name="client_address"/>
                 <w:r>
                   <w:rPr>
                     <w:rFonts w:ascii="Microsoft Sans Serif" w:hAnsi="Microsoft Sans Serif" w:cs="Microsoft Sans Serif"/>
@@ -832,7 +892,7 @@
                   <w:fldChar w:fldCharType="end"/>
                 </w:r>
               </w:p>
-              <w:bookmarkEnd w:id="3" w:displacedByCustomXml="next"/>
+              <w:bookmarkEnd w:id="4" w:displacedByCustomXml="next"/>
             </w:sdtContent>
           </w:sdt>
           <w:sdt>
@@ -880,7 +940,7 @@
                     </w:ffData>
                   </w:fldChar>
                 </w:r>
-                <w:bookmarkStart w:id="4" w:name="client_postal_code"/>
+                <w:bookmarkStart w:id="5" w:name="client_postal_code"/>
                 <w:r>
                   <w:rPr>
                     <w:rFonts w:ascii="Microsoft Sans Serif" w:hAnsi="Microsoft Sans Serif" w:cs="Microsoft Sans Serif"/>
@@ -931,7 +991,7 @@
                   </w:rPr>
                   <w:fldChar w:fldCharType="end"/>
                 </w:r>
-                <w:bookmarkEnd w:id="4"/>
+                <w:bookmarkEnd w:id="5"/>
               </w:p>
               <w:p>
                 <w:pPr>
@@ -963,7 +1023,7 @@
                     </w:ffData>
                   </w:fldChar>
                 </w:r>
-                <w:bookmarkStart w:id="5" w:name="client_city"/>
+                <w:bookmarkStart w:id="6" w:name="client_city"/>
                 <w:r>
                   <w:rPr>
                     <w:rFonts w:ascii="Microsoft Sans Serif" w:hAnsi="Microsoft Sans Serif" w:cs="Microsoft Sans Serif"/>
@@ -1015,7 +1075,7 @@
                   <w:fldChar w:fldCharType="end"/>
                 </w:r>
               </w:p>
-              <w:bookmarkEnd w:id="5" w:displacedByCustomXml="next"/>
+              <w:bookmarkEnd w:id="6" w:displacedByCustomXml="next"/>
             </w:sdtContent>
           </w:sdt>
         </w:tc>
@@ -1873,7 +1933,29 @@
                 <w:szCs w:val="24"/>
                 <w:lang w:val="pt-PT"/>
               </w:rPr>
-              <w:t xml:space="preserve"> days net</w:t>
+              <w:t xml:space="preserve"> </w:t>
+            </w:r>
+            <w:proofErr w:type="spellStart"/>
+            <w:r>
+              <w:rPr>
+                <w:rFonts w:ascii="Microsoft Sans Serif" w:hAnsi="Microsoft Sans Serif" w:cs="Microsoft Sans Serif"/>
+                <w:color w:val="284434"/>
+                <w:sz w:val="24"/>
+                <w:szCs w:val="24"/>
+                <w:lang w:val="pt-PT"/>
+              </w:rPr>
+              <w:t>days</w:t>
+            </w:r>
+            <w:proofErr w:type="spellEnd"/>
+            <w:r>
+              <w:rPr>
+                <w:rFonts w:ascii="Microsoft Sans Serif" w:hAnsi="Microsoft Sans Serif" w:cs="Microsoft Sans Serif"/>
+                <w:color w:val="284434"/>
+                <w:sz w:val="24"/>
+                <w:szCs w:val="24"/>
+                <w:lang w:val="pt-PT"/>
+              </w:rPr>
+              <w:t xml:space="preserve"> net</w:t>
             </w:r>
           </w:p>
         </w:tc>
@@ -4238,9 +4320,11 @@
   <w:rsids>
     <w:rsidRoot w:val="002A4457"/>
     <w:rsid w:val="00044C0C"/>
+    <w:rsid w:val="00131585"/>
     <w:rsid w:val="002A4457"/>
     <w:rsid w:val="00345E94"/>
     <w:rsid w:val="0037421F"/>
+    <w:rsid w:val="0043225F"/>
     <w:rsid w:val="00496059"/>
     <w:rsid w:val="009E37CC"/>
     <w:rsid w:val="00CD0386"/>

</xml_diff>